<commit_message>
[feature] reevaluated the sovereignty scores for the cloud providers and merged T-cloud & Deutsch Com as the same company
</commit_message>
<xml_diff>
--- a/attachments/[THESIS] - Scope 3.docx
+++ b/attachments/[THESIS] - Scope 3.docx
@@ -470,14 +470,12 @@
         <w:rPr>
           <w:i w:val="1"/>
           <w:iCs w:val="1"/>
-          <w:strike w:val="1"/>
-        </w:rPr>
-      </w:pPr>
-      <w:r>
-        <w:rPr>
-          <w:i w:val="1"/>
-          <w:iCs w:val="1"/>
-          <w:strike w:val="1"/>
+        </w:rPr>
+      </w:pPr>
+      <w:r>
+        <w:rPr>
+          <w:i w:val="1"/>
+          <w:iCs w:val="1"/>
           <w:rtl w:val="0"/>
         </w:rPr>
         <w:t xml:space="preserve">Arvato systems</w:t>
@@ -503,28 +501,6 @@
           <w:rtl w:val="0"/>
         </w:rPr>
         <w:t xml:space="preserve">T-Systems Open Telekom Cloud </w:t>
-      </w:r>
-    </w:p>
-    <w:p>
-      <w:pPr>
-        <w:numPr>
-          <w:ilvl w:val="0"/>
-          <w:numId w:val="7"/>
-        </w:numPr>
-        <w:ind w:left="2160" w:hanging="360"/>
-        <w:rPr>
-          <w:i w:val="1"/>
-          <w:iCs w:val="1"/>
-          <w:u w:val="none"/>
-        </w:rPr>
-      </w:pPr>
-      <w:r>
-        <w:rPr>
-          <w:i w:val="1"/>
-          <w:iCs w:val="1"/>
-          <w:rtl w:val="0"/>
-        </w:rPr>
-        <w:t xml:space="preserve">Deutsche Telekom / Detecon</w:t>
       </w:r>
     </w:p>
     <w:p>

</xml_diff>